<commit_message>
docs: régénère le Recap fonctionnalités par profil (périmètre langues 4)
- scripts/docs/recap-profils.js : périmètre langues corrigé (Baatɔnum/Dendi
  → Yorùbá) aux 2 emplacements (profil Patient + socle transverse) ;
  ligne Diaspora « famille » → carnet de bénéficiaires (fonctionnalité réelle).
- Recap_Fonctionnalites_Profils_DigiSante.docx régénéré via le script
  (DOC_DATE=juillet 2026) ; validation XSD + redlining OK.

Co-Authored-By: Claude Fable 5 <noreply@anthropic.com>
Claude-Session: https://claude.ai/code/session_01YJsoUBem9tqX3shKt2EXEk
</commit_message>
<xml_diff>
--- a/docs/Recap_Fonctionnalites_Profils_DigiSante.docx
+++ b/docs/Recap_Fonctionnalites_Profils_DigiSante.docx
@@ -90,7 +90,7 @@
           <w:sz w:val="18"/>
           <w:szCs w:val="18"/>
         </w:rPr>
-        <w:t xml:space="preserve">PWA e-santé offline-first — Bénin · 15 juin 2026</w:t>
+        <w:t xml:space="preserve">PWA e-santé offline-first — Bénin · juillet 2026</w:t>
       </w:r>
     </w:p>
     <w:p>
@@ -152,7 +152,7 @@
         <w:spacing w:after="80"/>
       </w:pPr>
       <w:r>
-        <w:t xml:space="preserve">Profil &amp; paramètres : nom, langues parlées, langue de l’application (FR, EN, Fɔ̀ngbè, Baatɔnum, Dendi), déconnexion.</w:t>
+        <w:t xml:space="preserve">Profil &amp; paramètres : nom, langues parlées, langue de l’application (FR, EN, Fɔ̀ngbè, Yorùbá), déconnexion.</w:t>
       </w:r>
     </w:p>
     <w:p>
@@ -679,7 +679,7 @@
         <w:spacing w:after="80"/>
       </w:pPr>
       <w:r>
-        <w:t xml:space="preserve">Gestion de la famille ; profil &amp; déconnexion.</w:t>
+        <w:t xml:space="preserve">Carnet de bénéficiaires (proches au Bénin) : ajout, édition, suppression ; profil &amp; déconnexion.</w:t>
       </w:r>
     </w:p>
     <w:p>
@@ -830,7 +830,7 @@
         <w:spacing w:after="80"/>
       </w:pPr>
       <w:r>
-        <w:t xml:space="preserve">Offline-first : Progressive Web App, service worker, file de synchronisation des actions ; multilingue (FR, EN, Fɔ̀ngbè, Baatɔnum, Dendi).</w:t>
+        <w:t xml:space="preserve">Offline-first : Progressive Web App, service worker, file de synchronisation des actions ; multilingue (FR, EN, Fɔ̀ngbè, Yorùbá).</w:t>
       </w:r>
     </w:p>
     <w:p>

</xml_diff>